<commit_message>
Refine announcement report and deletion flow
</commit_message>
<xml_diff>
--- a/docs/legal-release-package/word/03_SSD_Manager_Nutzungsbedingungen.docx
+++ b/docs/legal-release-package/word/03_SSD_Manager_Nutzungsbedingungen.docx
@@ -99,7 +99,7 @@
           </w:tcPr>
           <w:p>
             <w:r>
-              <w:t>26.07.2026</w:t>
+              <w:t>20.08.2026</w:t>
             </w:r>
           </w:p>
         </w:tc>
@@ -286,7 +286,7 @@
         <w:rPr>
           <w:lang w:val="de-DE"/>
         </w:rPr>
-        <w:t>Verdacht auf Missbrauch ist unverzüglich an Schule oder support@ssd-manager.minutmate.com zu melden.</w:t>
+        <w:t>Unangemessene Ankündigungen können durch langes Drücken direkt in der App an die Lehreraufsicht gemeldet werden. Weitere Verdachtsfälle sind unverzüglich an Schule oder support@ssd-manager.minutmate.com zu melden.</w:t>
       </w:r>
     </w:p>
     <w:p>
@@ -386,7 +386,7 @@
         <w:rPr>
           <w:lang w:val="de-DE"/>
         </w:rPr>
-        <w:t>Nutzende behalten Rechte an rechtmäßig bereitgestellten Inhalten und räumen die zur Speicherung, Anzeige, Übermittlung und Sicherung erforderlichen Nutzungsrechte für die Vertragsdauer ein. Autorisierte Lehreraufsicht und Sani-Leitung dürfen Konten und organisatorische Inhalte entsprechend Schulvorgaben verwalten.</w:t>
+        <w:t>Nutzende behalten Rechte an rechtmäßig bereitgestellten Inhalten und räumen die zur Speicherung, Anzeige, Übermittlung und Sicherung erforderlichen Nutzungsrechte für die Vertragsdauer ein. Die Lehreraufsicht kann gemeldete Nachrichten unverändert stehen lassen oder löschen. Nutzer können ihre eigenen Nachrichten löschen; in beiden Löschfällen bleiben im Chat nachvollziehbare Hinweise sichtbar und zugehörige Dateibytes werden entfernt. Autorisierte Lehreraufsicht und Sani-Leitung dürfen Konten entsprechend Schulvorgaben verwalten.</w:t>
       </w:r>
     </w:p>
     <w:p>

</xml_diff>